<commit_message>
Lab 7 dry-run fixes (L7-1 BLOCKER B_T→BandT, Description__c, re-apply r2 Part 2 changes, list view Watch Out)
</commit_message>
<xml_diff>
--- a/workshop-site/labs/Lab 07 - Participant.docx
+++ b/workshop-site/labs/Lab 07 - Participant.docx
@@ -25,7 +25,7 @@
           <w:color w:val="6A6A6A"/>
           <w:sz w:val="20"/>
         </w:rPr>
-        <w:t>ServicePulse 360 Workshop v0.7 (revision 2) | Estimated time: 70 minutes | Build an Agentforce Employee Agent that collapses the full Service Disruption lifecycle into a single natural-language sentence. The dispatcher types one sentence, the agent creates the record, drafts the Rider-Facing Message via the Prompt Template you built in Lab 6, submits for approval, and quotes the drafted message back in the chat. The payoff for everything you built in Labs 1 through 6.</w:t>
+        <w:t>ServicePulse 360 Workshop v0.7 (revision 3) | Estimated time: 70 minutes (base) or 85 minutes with the optional Part 5 stretch | Build an Agentforce Employee Agent that collapses the full Service Disruption lifecycle into a single natural-language sentence. The dispatcher types one sentence, the agent creates the record, drafts the Rider-Facing Message via the Prompt Template you built in Lab 6, submits for approval, and quotes the drafted message back in the chat. The payoff for everything you built in Labs 1 through 6.</w:t>
       </w:r>
     </w:p>
     <w:p>
@@ -76,7 +76,7 @@
         <w:spacing w:after="40"/>
       </w:pPr>
       <w:r>
-        <w:t>A cloned Agentforce Employee Agent for the MTA Dispatcher persona.</w:t>
+        <w:t>A new Agentforce Employee Agent for the MTA Dispatcher persona.</w:t>
       </w:r>
     </w:p>
     <w:p>
@@ -134,7 +134,7 @@
         <w:spacing w:after="40"/>
       </w:pPr>
       <w:r>
-        <w:t>Labs 1 through 6 are complete. SD-00001 exists with Headline, Public Description, and Rider-Facing Message populated. The Rider Facing Message Generator prompt template is active.</w:t>
+        <w:t>Labs 1 through 6 are complete. SD-00001 exists with Headline, Description, and Rider-Facing Message populated. The Rider Facing Message Generator prompt template is active.</w:t>
       </w:r>
     </w:p>
     <w:p>
@@ -230,36 +230,6 @@
     </w:p>
     <w:p>
       <w:pPr>
-        <w:spacing w:after="40"/>
-        <w:ind w:left="340" w:hanging="340"/>
-      </w:pPr>
-      <w:r>
-        <w:rPr>
-          <w:b/>
-        </w:rPr>
-        <w:t xml:space="preserve">3. </w:t>
-      </w:r>
-      <w:r>
-        <w:t>Open SD-00001 to confirm Rider-Facing Message is populated (from Lab 6 Part 3.7) and Publish Status is Approved (from Lab 6 Part 4.6).</w:t>
-      </w:r>
-    </w:p>
-    <w:p>
-      <w:pPr>
-        <w:spacing w:after="40"/>
-        <w:ind w:left="340" w:hanging="340"/>
-      </w:pPr>
-      <w:r>
-        <w:rPr>
-          <w:b/>
-        </w:rPr>
-        <w:t xml:space="preserve">4. </w:t>
-      </w:r>
-      <w:r>
-        <w:t>In the top-right of the Salesforce UI, locate the Agentforce icon (a dark-blue circle with a stylized robot face, tooltip reads "Agentforce" on hover). Click it to open the Agent panel on the right side of the screen.</w:t>
-      </w:r>
-    </w:p>
-    <w:p>
-      <w:pPr>
         <w:spacing w:before="80" w:after="80"/>
         <w:ind w:left="227"/>
       </w:pPr>
@@ -271,6 +241,52 @@
         <w:t xml:space="preserve">Watch out: </w:t>
       </w:r>
       <w:r>
+        <w:t>If the Service Disruptions tab shows only Recently Viewed and SD-00001 is not visible, create an All list view: click the list view dropdown, click New, Name = All Service Disruptions, All records, Save. Records that an agent creates later in Lab 7 are never 'recently viewed', so you need an All view to see them.</w:t>
+      </w:r>
+    </w:p>
+    <w:p>
+      <w:pPr>
+        <w:spacing w:after="40"/>
+        <w:ind w:left="340" w:hanging="340"/>
+      </w:pPr>
+      <w:r>
+        <w:rPr>
+          <w:b/>
+        </w:rPr>
+        <w:t xml:space="preserve">3. </w:t>
+      </w:r>
+      <w:r>
+        <w:t>Open SD-00001 to confirm Rider-Facing Message is populated (from Lab 6 Part 3.7) and Publish Status is Approved (from Lab 6 Part 4.6).</w:t>
+      </w:r>
+    </w:p>
+    <w:p>
+      <w:pPr>
+        <w:spacing w:after="40"/>
+        <w:ind w:left="340" w:hanging="340"/>
+      </w:pPr>
+      <w:r>
+        <w:rPr>
+          <w:b/>
+        </w:rPr>
+        <w:t xml:space="preserve">4. </w:t>
+      </w:r>
+      <w:r>
+        <w:t>In the top-right of the Salesforce UI, locate the Agentforce icon (a dark-blue circle with a stylized robot face, tooltip reads "Agentforce" on hover). Click it to open the Agent panel on the right side of the screen.</w:t>
+      </w:r>
+    </w:p>
+    <w:p>
+      <w:pPr>
+        <w:spacing w:before="80" w:after="80"/>
+        <w:ind w:left="227"/>
+      </w:pPr>
+      <w:r>
+        <w:rPr>
+          <w:b/>
+          <w:color w:val="B45F06"/>
+        </w:rPr>
+        <w:t xml:space="preserve">Watch out: </w:t>
+      </w:r>
+      <w:r>
         <w:t>If the Agentforce icon is missing, confirm Agentforce (Default) permission set is assigned to your user. Setup &gt; Permission Set Assignments &gt; click your user &gt; verify Agentforce (Default) is in the list. If missing, add it, refresh the browser, and try again.</w:t>
       </w:r>
     </w:p>
@@ -286,7 +302,7 @@
         <w:t xml:space="preserve">5. </w:t>
       </w:r>
       <w:r>
-        <w:t>You should see a chat panel titled "Merchant Management Assistant" (the Pronto template's default agent) with a "Let's chat!" greeting and three starter prompt chips. Note the agent name at the top-left of the panel. We'll replace this with our MTA Dispatcher Agent in Part 3.</w:t>
+        <w:t>You should see a chat panel titled "Merchant Management Agent" (the Pronto template's default agent) with a "Let's chat!" greeting and three starter prompt chips. Note the agent name at the top-left of the panel. We'll replace this with our MTA Dispatcher Agent in Part 3.</w:t>
       </w:r>
     </w:p>
     <w:p>
@@ -419,7 +435,7 @@
         <w:t xml:space="preserve">3. </w:t>
       </w:r>
       <w:r>
-        <w:t>Select Start From Scratch, click Next.</w:t>
+        <w:t>Click Next.</w:t>
       </w:r>
     </w:p>
     <w:p>
@@ -581,10 +597,7 @@
         <w:ind w:left="680" w:hanging="227"/>
       </w:pPr>
       <w:r>
-        <w:t xml:space="preserve">• </w:t>
-      </w:r>
-      <w:r>
-        <w:t>affectedLine - Text - Available for Input</w:t>
+        <w:t xml:space="preserve">• affectedLine - Text - Available for Input</w:t>
       </w:r>
     </w:p>
     <w:p>
@@ -593,10 +606,7 @@
         <w:ind w:left="680" w:hanging="227"/>
       </w:pPr>
       <w:r>
-        <w:t xml:space="preserve">• </w:t>
-      </w:r>
-      <w:r>
-        <w:t>headline - Text - Available for Input</w:t>
+        <w:t xml:space="preserve">• headline - Text - Available for Input</w:t>
       </w:r>
     </w:p>
     <w:p>
@@ -605,10 +615,7 @@
         <w:ind w:left="680" w:hanging="227"/>
       </w:pPr>
       <w:r>
-        <w:t xml:space="preserve">• </w:t>
-      </w:r>
-      <w:r>
-        <w:t>description - Text - Available for Input</w:t>
+        <w:t xml:space="preserve">• description - Text - Available for Input</w:t>
       </w:r>
     </w:p>
     <w:p>
@@ -740,10 +747,7 @@
         <w:ind w:left="680" w:hanging="227"/>
       </w:pPr>
       <w:r>
-        <w:t xml:space="preserve">• </w:t>
-      </w:r>
-      <w:r>
-        <w:t>Condition 1: Field: SobjectType. Operator: Equals. Value: Service_Disruption__c (type it as a literal string, with the __c suffix).</w:t>
+        <w:t xml:space="preserve">• Condition 1: Field: SObject Type Name. Operator: Equals. Value: Service_Disruption__c (type it as a literal string, with the __c suffix).</w:t>
       </w:r>
     </w:p>
     <w:p>
@@ -752,10 +756,7 @@
         <w:ind w:left="680" w:hanging="227"/>
       </w:pPr>
       <w:r>
-        <w:t xml:space="preserve">• </w:t>
-      </w:r>
-      <w:r>
-        <w:t>Condition 2 (click Add Condition): Field: DeveloperName. Operator: Equals. Value: click the resource picker and select agencyRecordType.</w:t>
+        <w:t xml:space="preserve">• Condition 2 (click Add Condition): Field: Record Type Name. Operator: Equals. Value: click the resource picker and select agencyRecordType.</w:t>
       </w:r>
     </w:p>
     <w:p>
@@ -941,10 +942,7 @@
         <w:ind w:left="680" w:hanging="227"/>
       </w:pPr>
       <w:r>
-        <w:t xml:space="preserve">• </w:t>
-      </w:r>
-      <w:r>
-        <w:t>Field: Record Type ID. Value: click the resource picker. Under Get Records, click "Record Type from Get_Agency_Record_Type" to drill in. Scroll to find Record Type ID and click it. The value populates as {!Get_Agency_Record_Type.Id}.</w:t>
+        <w:t xml:space="preserve">• Field: Record Type ID. Value: click the resource picker. Under Get Records, click "Record Type from Get_Agency_Record_Type" to drill in. Scroll to find Record Type ID and click it. The value populates as {!Get_Agency_Record_Type.Id}.</w:t>
       </w:r>
     </w:p>
     <w:p>
@@ -953,10 +951,7 @@
         <w:ind w:left="680" w:hanging="227"/>
       </w:pPr>
       <w:r>
-        <w:t xml:space="preserve">• </w:t>
-      </w:r>
-      <w:r>
-        <w:t>Field: Headline__c. Value: {!headline}.</w:t>
+        <w:t xml:space="preserve">• Field: Headline__c. Value: {!headline}.</w:t>
       </w:r>
     </w:p>
     <w:p>
@@ -965,10 +960,7 @@
         <w:ind w:left="680" w:hanging="227"/>
       </w:pPr>
       <w:r>
-        <w:t xml:space="preserve">• </w:t>
-      </w:r>
-      <w:r>
-        <w:t>Field: Public_Description__c. Value: {!description}.</w:t>
+        <w:t xml:space="preserve">• Field: Description__c. Value: {!description}.</w:t>
       </w:r>
     </w:p>
     <w:p>
@@ -977,10 +969,7 @@
         <w:ind w:left="680" w:hanging="227"/>
       </w:pPr>
       <w:r>
-        <w:t xml:space="preserve">• </w:t>
-      </w:r>
-      <w:r>
-        <w:t>Field: Affected_Line__c. Value: {!affectedLine}.</w:t>
+        <w:t xml:space="preserve">• Field: Affected_Line__c. Value: {!affectedLine}.</w:t>
       </w:r>
     </w:p>
     <w:p>
@@ -989,10 +978,7 @@
         <w:ind w:left="680" w:hanging="227"/>
       </w:pPr>
       <w:r>
-        <w:t xml:space="preserve">• </w:t>
-      </w:r>
-      <w:r>
-        <w:t>Field: Status__c. Value: Active (type as literal).</w:t>
+        <w:t xml:space="preserve">• Field: Status__c. Value: Active (type as literal).</w:t>
       </w:r>
     </w:p>
     <w:p>
@@ -1001,10 +987,7 @@
         <w:ind w:left="680" w:hanging="227"/>
       </w:pPr>
       <w:r>
-        <w:t xml:space="preserve">• </w:t>
-      </w:r>
-      <w:r>
-        <w:t>Field: Disruption Start Date/Time. Value: click the resource picker, then under $Flow click "Running Flow Interview" to drill in, then click CurrentDateTime. The value populates as {!$Flow.CurrentDateTime}.</w:t>
+        <w:t xml:space="preserve">• Field: Disruption Start Date/Time. Value: click the resource picker, then under $Flow click "Running Flow Interview" to drill in, then click CurrentDateTime. The value populates as {!$Flow.CurrentDateTime}.</w:t>
       </w:r>
     </w:p>
     <w:p>
@@ -1043,10 +1026,7 @@
         <w:ind w:left="680" w:hanging="227"/>
       </w:pPr>
       <w:r>
-        <w:t xml:space="preserve">• </w:t>
-      </w:r>
-      <w:r>
-        <w:t>Resource Type: Variable.</w:t>
+        <w:t xml:space="preserve">• Resource Type: Variable.</w:t>
       </w:r>
     </w:p>
     <w:p>
@@ -1055,10 +1035,7 @@
         <w:ind w:left="680" w:hanging="227"/>
       </w:pPr>
       <w:r>
-        <w:t xml:space="preserve">• </w:t>
-      </w:r>
-      <w:r>
-        <w:t>API Name: newSDId.</w:t>
+        <w:t xml:space="preserve">• API Name: newSDId.</w:t>
       </w:r>
     </w:p>
     <w:p>
@@ -1067,10 +1044,7 @@
         <w:ind w:left="680" w:hanging="227"/>
       </w:pPr>
       <w:r>
-        <w:t xml:space="preserve">• </w:t>
-      </w:r>
-      <w:r>
-        <w:t>Data Type: Text.</w:t>
+        <w:t xml:space="preserve">• Data Type: Text.</w:t>
       </w:r>
     </w:p>
     <w:p>
@@ -1079,10 +1053,7 @@
         <w:ind w:left="680" w:hanging="227"/>
       </w:pPr>
       <w:r>
-        <w:t xml:space="preserve">• </w:t>
-      </w:r>
-      <w:r>
-        <w:t>Click Done.</w:t>
+        <w:t xml:space="preserve">• Click Done.</w:t>
       </w:r>
     </w:p>
     <w:p>
@@ -1213,10 +1184,7 @@
         <w:ind w:left="680" w:hanging="227"/>
       </w:pPr>
       <w:r>
-        <w:t xml:space="preserve">• </w:t>
-      </w:r>
-      <w:r>
-        <w:t>Field: Id. Operator: Equals. Value: {!newSDId}.</w:t>
+        <w:t xml:space="preserve">• Field: Id. Operator: Equals. Value: {!newSDId}.</w:t>
       </w:r>
     </w:p>
     <w:p>
@@ -1535,10 +1503,7 @@
         <w:ind w:left="680" w:hanging="227"/>
       </w:pPr>
       <w:r>
-        <w:t xml:space="preserve">• </w:t>
-      </w:r>
-      <w:r>
-        <w:t>Field: Record ID. Operator: Equals. Value: {!newSDId}.</w:t>
+        <w:t xml:space="preserve">• Field: Record ID. Operator: Equals. Value: {!newSDId}.</w:t>
       </w:r>
     </w:p>
     <w:p>
@@ -1562,10 +1527,7 @@
         <w:ind w:left="680" w:hanging="227"/>
       </w:pPr>
       <w:r>
-        <w:t xml:space="preserve">• </w:t>
-      </w:r>
-      <w:r>
-        <w:t>Field: Rider-Facing Message. Value: click the resource picker. Under Action, click "Outputs from Generate Rider Message" to drill in. Click Prompt Response. The value populates as {!Generate_Rider_Message.Prompt_Response}.</w:t>
+        <w:t xml:space="preserve">• Field: Rider-Facing Message. Value: click the resource picker. Under Action, click "Outputs from Generate Rider Message" to drill in. Click Prompt Response. The value populates as {!Generate_Rider_Message.Prompt_Response}.</w:t>
       </w:r>
     </w:p>
     <w:p>
@@ -1706,10 +1668,7 @@
         <w:ind w:left="680" w:hanging="227"/>
       </w:pPr>
       <w:r>
-        <w:t xml:space="preserve">• </w:t>
-      </w:r>
-      <w:r>
-        <w:t>Record ID: {!newSDId}.</w:t>
+        <w:t xml:space="preserve">• Record ID: {!newSDId}.</w:t>
       </w:r>
     </w:p>
     <w:p>
@@ -1718,10 +1677,7 @@
         <w:ind w:left="680" w:hanging="227"/>
       </w:pPr>
       <w:r>
-        <w:t xml:space="preserve">• </w:t>
-      </w:r>
-      <w:r>
-        <w:t>Submitter Comments (optional): leave blank or set to "Submitted via Agentforce".</w:t>
+        <w:t xml:space="preserve">• Submitter Comments (optional): leave blank or set to "Submitted via Agentforce".</w:t>
       </w:r>
     </w:p>
     <w:p>
@@ -1867,10 +1823,7 @@
         <w:ind w:left="680" w:hanging="227"/>
       </w:pPr>
       <w:r>
-        <w:t xml:space="preserve">• </w:t>
-      </w:r>
-      <w:r>
-        <w:t>API Name: draftedMessage.</w:t>
+        <w:t xml:space="preserve">• API Name: draftedMessage.</w:t>
       </w:r>
     </w:p>
     <w:p>
@@ -1879,10 +1832,7 @@
         <w:ind w:left="680" w:hanging="227"/>
       </w:pPr>
       <w:r>
-        <w:t xml:space="preserve">• </w:t>
-      </w:r>
-      <w:r>
-        <w:t>Data Type: Text.</w:t>
+        <w:t xml:space="preserve">• Data Type: Text.</w:t>
       </w:r>
     </w:p>
     <w:p>
@@ -1891,10 +1841,7 @@
         <w:ind w:left="680" w:hanging="227"/>
       </w:pPr>
       <w:r>
-        <w:t xml:space="preserve">• </w:t>
-      </w:r>
-      <w:r>
-        <w:t>Check Available for Output.</w:t>
+        <w:t xml:space="preserve">• Check Available for Output.</w:t>
       </w:r>
     </w:p>
     <w:p>
@@ -1903,10 +1850,7 @@
         <w:ind w:left="680" w:hanging="227"/>
       </w:pPr>
       <w:r>
-        <w:t xml:space="preserve">• </w:t>
-      </w:r>
-      <w:r>
-        <w:t>Click Done.</w:t>
+        <w:t xml:space="preserve">• Click Done.</w:t>
       </w:r>
     </w:p>
     <w:p>
@@ -1975,10 +1919,7 @@
         <w:ind w:left="680" w:hanging="227"/>
       </w:pPr>
       <w:r>
-        <w:t xml:space="preserve">• </w:t>
-      </w:r>
-      <w:r>
-        <w:t>Variable: {!newSDName}. Operator: Equals. Value: click the resource picker (Search a field...), under Get Records click "Service Disruption from Get_Created_SD" to drill in. Then click the Name field (it may be labeled "Service Disruption Name" or just "Name"). The value populates as {!Get_Created_SD.Name}. This is the SD-##### auto-number.</w:t>
+        <w:t xml:space="preserve">• Variable: {!newSDName}. Operator: Equals. Value: click the resource picker (Search a field...), under Get Records click "Service Disruption from Get_Created_SD" to drill in. Then click the Name field (it may be labeled "Service Disruption Name" or just "Name"). The value populates as {!Get_Created_SD.Name}. This is the SD-##### auto-number.</w:t>
       </w:r>
     </w:p>
     <w:p>
@@ -1987,10 +1928,7 @@
         <w:ind w:left="680" w:hanging="227"/>
       </w:pPr>
       <w:r>
-        <w:t xml:space="preserve">• </w:t>
-      </w:r>
-      <w:r>
-        <w:t>Variable: {!draftedMessage}. Operator: Equals. Value: click the resource picker, under Action click "Outputs from Generate Rider Message" to drill in, then click Prompt Response. The value populates as {!Generate_Rider_Message.Prompt_Response}.</w:t>
+        <w:t xml:space="preserve">• Variable: {!draftedMessage}. Operator: Equals. Value: click the resource picker, under Action click "Outputs from Generate Rider Message" to drill in, then click Prompt Response. The value populates as {!Generate_Rider_Message.Prompt_Response}.</w:t>
       </w:r>
     </w:p>
     <w:p>
@@ -2222,10 +2160,7 @@
         <w:ind w:left="680" w:hanging="227"/>
       </w:pPr>
       <w:r>
-        <w:t xml:space="preserve">• </w:t>
-      </w:r>
-      <w:r>
-        <w:t>Agent Name: MTA Dispatcher Agent.</w:t>
+        <w:t xml:space="preserve">• Agent Name: MTA Dispatcher Agent.</w:t>
       </w:r>
     </w:p>
     <w:p>
@@ -2234,10 +2169,7 @@
         <w:ind w:left="680" w:hanging="227"/>
       </w:pPr>
       <w:r>
-        <w:t xml:space="preserve">• </w:t>
-      </w:r>
-      <w:r>
-        <w:t>Developer Name: MTA_Dispatcher_Agent (auto-fills from Agent Name).</w:t>
+        <w:t xml:space="preserve">• Developer Name: MTA_Dispatcher_Agent (auto-fills from Agent Name).</w:t>
       </w:r>
     </w:p>
     <w:p>
@@ -2364,10 +2296,7 @@
         <w:ind w:left="680" w:hanging="227"/>
       </w:pPr>
       <w:r>
-        <w:t xml:space="preserve">• </w:t>
-      </w:r>
-      <w:r>
-        <w:t>Helps MTA dispatchers file, draft, and submit Service Disruptions through natural language.</w:t>
+        <w:t xml:space="preserve">• Helps MTA dispatchers file, draft, and submit Service Disruptions through natural language.</w:t>
       </w:r>
     </w:p>
     <w:p>
@@ -2448,10 +2377,7 @@
         <w:ind w:left="680" w:hanging="227"/>
       </w:pPr>
       <w:r>
-        <w:t xml:space="preserve">• </w:t>
-      </w:r>
-      <w:r>
-        <w:t>You are an operations assistant for MTA dispatchers. You help file Service Disruption records, draft rider-facing messages, and route them through approval. You communicate in a calm, professional tone appropriate for a transit operations center. When the dispatcher provides details about an operational problem, assume they want to file a Service Disruption unless they say otherwise.</w:t>
+        <w:t xml:space="preserve">• You are an operations assistant for MTA dispatchers. You help file Service Disruption records, draft rider-facing messages, and route them through approval. You communicate in a calm, professional tone appropriate for a transit operations center. When the dispatcher provides details about an operational problem, assume they want to file a Service Disruption unless they say otherwise.</w:t>
       </w:r>
     </w:p>
     <w:p>
@@ -2583,10 +2509,7 @@
         <w:ind w:left="680" w:hanging="227"/>
       </w:pPr>
       <w:r>
-        <w:t xml:space="preserve">• </w:t>
-      </w:r>
-      <w:r>
-        <w:t>The user wants to file, draft, or submit a Service Disruption for the MTA. Service Disruptions describe operational problems on NYCT subways, LIRR commuter rail, Metro-North commuter rail, or Bridges and Tunnels. The user will describe the agency, the affected line or roadway, a brief headline of what happened, and a description including any delay estimate or location detail.</w:t>
+        <w:t xml:space="preserve">• The user wants to file, draft, or submit a Service Disruption for the MTA. Service Disruptions describe operational problems on NYCT subways, LIRR commuter rail, Metro-North commuter rail, or Bridges and Tunnels. The user will describe the agency, the affected line or roadway, a brief headline of what happened, and a description including any delay estimate or location detail.</w:t>
       </w:r>
     </w:p>
     <w:p>
@@ -2610,10 +2533,7 @@
         <w:ind w:left="680" w:hanging="227"/>
       </w:pPr>
       <w:r>
-        <w:t xml:space="preserve">• </w:t>
-      </w:r>
-      <w:r>
-        <w:t>Help MTA dispatchers file Service Disruption records, draft rider-facing messages using the Rider Facing Message Generator prompt template, and route them through the approval process. Confirm agency, affected line, headline, and description before firing the action. If any of the four required inputs (agency, affected line, headline, description) is missing from the user's request, ask the user for only the specific missing fields. Do not re-ask for fields that have already been provided. Agency must be one of: NYCT, LIRR, MNR, B_T. If the user says the 7 Line or N train, infer NYCT. If the user says the Hudson Line or Harlem Line, infer MNR. If the user says the Montauk Branch or Port Washington Branch, infer LIRR. If the user says a bridge or tunnel name like Verrazzano, Throgs Neck, or Lincoln Tunnel, infer B_T. State the inferred agency in your reply so the dispatcher can correct it. After the File Service Disruption action completes, reply with the new Service Disruption Name and quote the drafted Rider-Facing Message verbatim so the dispatcher can see what was drafted before the Communications Lead approves it.</w:t>
+        <w:t xml:space="preserve">• Help MTA dispatchers file Service Disruption records, draft rider-facing messages using the Rider Facing Message Generator prompt template, and route them through the approval process. Confirm agency, affected line, headline, and description before firing the action. If any of the four required inputs (agency, affected line, headline, description) is missing from the user's request, ask the user for only the specific missing fields. Do not re-ask for fields that have already been provided. Agency must be one of: NYCT, LIRR, MNR, BandT. If the user says the 7 Line or N train, infer NYCT. If the user says the Hudson Line or Harlem Line, infer MNR. If the user says the Montauk Branch or Port Washington Branch, infer LIRR. If the user says a bridge or tunnel name like Verrazzano, Throgs Neck, or Lincoln Tunnel, infer BandT. State the inferred agency in your reply so the dispatcher can correct it. After the File Service Disruption action completes, reply with the new Service Disruption Name and quote the drafted Rider-Facing Message verbatim so the dispatcher can see what was drafted before the Communications Lead approves it.</w:t>
       </w:r>
     </w:p>
     <w:p>
@@ -2729,10 +2649,7 @@
         <w:ind w:left="680" w:hanging="227"/>
       </w:pPr>
       <w:r>
-        <w:t xml:space="preserve">• </w:t>
-      </w:r>
-      <w:r>
-        <w:t>Call this action when the user wants to file a new MTA Service Disruption. Required inputs are agency (NYCT, LIRR, MNR, or B_T), affected line, headline, and description. If any input is missing, ask the user for just the missing one. After the action returns, quote the newSDName and draftedMessage in your reply.</w:t>
+        <w:t xml:space="preserve">• Call this action when the user wants to file a new MTA Service Disruption. Required inputs are agency (NYCT, LIRR, MNR, or BandT), affected line, headline, and description. If any input is missing, ask the user for just the missing one. After the action returns, quote the newSDName and draftedMessage in your reply.</w:t>
       </w:r>
     </w:p>
     <w:p>
@@ -2832,10 +2749,7 @@
         <w:ind w:left="680" w:hanging="227"/>
       </w:pPr>
       <w:r>
-        <w:t xml:space="preserve">• </w:t>
-      </w:r>
-      <w:r>
-        <w:t>affectedLine: "The subway line, commuter rail line, or bridge/tunnel affected. For example: 7 Line, Hudson Line, Montauk Branch, Verrazzano-Narrows Bridge."</w:t>
+        <w:t xml:space="preserve">• affectedLine: "The subway line, commuter rail line, or bridge/tunnel affected. For example: 7 Line, Hudson Line, Montauk Branch, Verrazzano-Narrows Bridge."</w:t>
       </w:r>
     </w:p>
     <w:p>
@@ -2844,10 +2758,7 @@
         <w:ind w:left="680" w:hanging="227"/>
       </w:pPr>
       <w:r>
-        <w:t xml:space="preserve">• </w:t>
-      </w:r>
-      <w:r>
-        <w:t>agencyRecordType: "The MTA operating agency. One of: NYCT, LIRR, MNR, B_T. Infer from context if the user mentions a specific line or bridge/tunnel."</w:t>
+        <w:t xml:space="preserve">• agencyRecordType: "The MTA operating agency. One of: NYCT, LIRR, MNR, BandT. Infer from context if the user mentions a specific line or bridge/tunnel."</w:t>
       </w:r>
     </w:p>
     <w:p>
@@ -2856,10 +2767,7 @@
         <w:ind w:left="680" w:hanging="227"/>
       </w:pPr>
       <w:r>
-        <w:t xml:space="preserve">• </w:t>
-      </w:r>
-      <w:r>
-        <w:t>description: "A longer description including the issue, location detail, and any delay estimate. For example: Signal fault near Vernon Blvd station on the 7 Line. 20-minute delays expected eastbound."</w:t>
+        <w:t xml:space="preserve">• description: "A longer description including the issue, location detail, and any delay estimate. For example: Signal fault near Vernon Blvd station on the 7 Line. 20-minute delays expected eastbound."</w:t>
       </w:r>
     </w:p>
     <w:p>
@@ -2868,10 +2776,7 @@
         <w:ind w:left="680" w:hanging="227"/>
       </w:pPr>
       <w:r>
-        <w:t xml:space="preserve">• </w:t>
-      </w:r>
-      <w:r>
-        <w:t>headline: "A short, factual headline for the disruption. For example: Signal fault near Vernon Blvd station."</w:t>
+        <w:t xml:space="preserve">• headline: "A short, factual headline for the disruption. For example: Signal fault near Vernon Blvd station."</w:t>
       </w:r>
     </w:p>
     <w:p>
@@ -2926,10 +2831,7 @@
         <w:ind w:left="680" w:hanging="227"/>
       </w:pPr>
       <w:r>
-        <w:t xml:space="preserve">• </w:t>
-      </w:r>
-      <w:r>
-        <w:t>draftedMessage: "The AI-drafted Rider-Facing Message. Quote this verbatim in your reply so the dispatcher can see what was drafted."</w:t>
+        <w:t xml:space="preserve">• draftedMessage: "The AI-drafted Rider-Facing Message. Quote this verbatim in your reply so the dispatcher can see what was drafted."</w:t>
       </w:r>
     </w:p>
     <w:p>
@@ -2938,10 +2840,7 @@
         <w:ind w:left="680" w:hanging="227"/>
       </w:pPr>
       <w:r>
-        <w:t xml:space="preserve">• </w:t>
-      </w:r>
-      <w:r>
-        <w:t>newSDName: "The new Service Disruption record Name, formatted as SD-#####. Quote this in your reply."</w:t>
+        <w:t xml:space="preserve">• newSDName: "The new Service Disruption record Name, formatted as SD-#####. Quote this in your reply."</w:t>
       </w:r>
     </w:p>
     <w:p>
@@ -3500,10 +3399,7 @@
         <w:ind w:left="680" w:hanging="227"/>
       </w:pPr>
       <w:r>
-        <w:t xml:space="preserve">• </w:t>
-      </w:r>
-      <w:r>
-        <w:t>File a Service Disruption. NYCT, 7 Line, signal fault near Vernon Blvd station, 20-minute delays expected eastbound.</w:t>
+        <w:t xml:space="preserve">• File a Service Disruption. NYCT, 7 Line, signal fault near Vernon Blvd station, 20-minute delays expected eastbound.</w:t>
       </w:r>
     </w:p>
     <w:p>
@@ -3542,10 +3438,7 @@
         <w:ind w:left="680" w:hanging="227"/>
       </w:pPr>
       <w:r>
-        <w:t xml:space="preserve">• </w:t>
-      </w:r>
-      <w:r>
-        <w:t>The agent recognizes the Service Disruption Management Topic.</w:t>
+        <w:t xml:space="preserve">• The agent recognizes the Service Disruption Management Topic.</w:t>
       </w:r>
     </w:p>
     <w:p>
@@ -3554,10 +3447,7 @@
         <w:ind w:left="680" w:hanging="227"/>
       </w:pPr>
       <w:r>
-        <w:t xml:space="preserve">• </w:t>
-      </w:r>
-      <w:r>
-        <w:t>The agent decides to call the File Service Disruption action.</w:t>
+        <w:t xml:space="preserve">• The agent decides to call the File Service Disruption action.</w:t>
       </w:r>
     </w:p>
     <w:p>
@@ -3566,10 +3456,7 @@
         <w:ind w:left="680" w:hanging="227"/>
       </w:pPr>
       <w:r>
-        <w:t xml:space="preserve">• </w:t>
-      </w:r>
-      <w:r>
-        <w:t>The action fires. (You may see a brief 'thinking' indicator.)</w:t>
+        <w:t xml:space="preserve">• The action fires. (You may see a brief 'thinking' indicator.)</w:t>
       </w:r>
     </w:p>
     <w:p>
@@ -3578,10 +3465,7 @@
         <w:ind w:left="680" w:hanging="227"/>
       </w:pPr>
       <w:r>
-        <w:t xml:space="preserve">• </w:t>
-      </w:r>
-      <w:r>
-        <w:t>The agent replies with the new Service Disruption Name (SD-#####) and quotes the drafted Rider-Facing Message.</w:t>
+        <w:t xml:space="preserve">• The agent replies with the new Service Disruption Name (SD-#####) and quotes the drafted Rider-Facing Message.</w:t>
       </w:r>
     </w:p>
     <w:p>
@@ -3624,10 +3508,7 @@
         <w:ind w:left="680" w:hanging="227"/>
       </w:pPr>
       <w:r>
-        <w:t xml:space="preserve">• </w:t>
-      </w:r>
-      <w:r>
-        <w:t>Record Type: NYCT</w:t>
+        <w:t xml:space="preserve">• Record Type: NYCT</w:t>
       </w:r>
     </w:p>
     <w:p>
@@ -3636,10 +3517,7 @@
         <w:ind w:left="680" w:hanging="227"/>
       </w:pPr>
       <w:r>
-        <w:t xml:space="preserve">• </w:t>
-      </w:r>
-      <w:r>
-        <w:t>Affected Line: 7 Line</w:t>
+        <w:t xml:space="preserve">• Affected Line: 7 Line</w:t>
       </w:r>
     </w:p>
     <w:p>
@@ -3648,10 +3526,7 @@
         <w:ind w:left="680" w:hanging="227"/>
       </w:pPr>
       <w:r>
-        <w:t xml:space="preserve">• </w:t>
-      </w:r>
-      <w:r>
-        <w:t>Headline: Signal fault near Vernon Blvd station</w:t>
+        <w:t xml:space="preserve">• Headline: Signal fault near Vernon Blvd station</w:t>
       </w:r>
     </w:p>
     <w:p>
@@ -3660,10 +3535,7 @@
         <w:ind w:left="680" w:hanging="227"/>
       </w:pPr>
       <w:r>
-        <w:t xml:space="preserve">• </w:t>
-      </w:r>
-      <w:r>
-        <w:t>Public Description: Signal fault near Vernon Blvd station, 20-minute delays expected eastbound (or similar).</w:t>
+        <w:t xml:space="preserve">• Description: Signal fault near Vernon Blvd station, 20-minute delays expected eastbound (or similar).</w:t>
       </w:r>
     </w:p>
     <w:p>
@@ -3672,10 +3544,7 @@
         <w:ind w:left="680" w:hanging="227"/>
       </w:pPr>
       <w:r>
-        <w:t xml:space="preserve">• </w:t>
-      </w:r>
-      <w:r>
-        <w:t>Status: Active</w:t>
+        <w:t xml:space="preserve">• Status: Active</w:t>
       </w:r>
     </w:p>
     <w:p>
@@ -3684,10 +3553,7 @@
         <w:ind w:left="680" w:hanging="227"/>
       </w:pPr>
       <w:r>
-        <w:t xml:space="preserve">• </w:t>
-      </w:r>
-      <w:r>
-        <w:t>Disruption Start Date/Time: today, roughly now</w:t>
+        <w:t xml:space="preserve">• Disruption Start Date/Time: today, roughly now</w:t>
       </w:r>
     </w:p>
     <w:p>
@@ -3696,10 +3562,7 @@
         <w:ind w:left="680" w:hanging="227"/>
       </w:pPr>
       <w:r>
-        <w:t xml:space="preserve">• </w:t>
-      </w:r>
-      <w:r>
-        <w:t>Rider-Facing Message: populated with the AI draft</w:t>
+        <w:t xml:space="preserve">• Rider-Facing Message: populated with the AI draft</w:t>
       </w:r>
     </w:p>
     <w:p>
@@ -3708,10 +3571,7 @@
         <w:ind w:left="680" w:hanging="227"/>
       </w:pPr>
       <w:r>
-        <w:t xml:space="preserve">• </w:t>
-      </w:r>
-      <w:r>
-        <w:t>Publish Status: Pending Approval (because the Flow called Submit for Approval)</w:t>
+        <w:t xml:space="preserve">• Publish Status: Pending Approval (because the Flow called Submit for Approval)</w:t>
       </w:r>
     </w:p>
     <w:p>
@@ -3768,10 +3628,7 @@
         <w:ind w:left="680" w:hanging="227"/>
       </w:pPr>
       <w:r>
-        <w:t xml:space="preserve">• </w:t>
-      </w:r>
-      <w:r>
-        <w:t>We have a signal problem on the 7 Line.</w:t>
+        <w:t xml:space="preserve">• We have a signal problem on the 7 Line.</w:t>
       </w:r>
     </w:p>
     <w:p>
@@ -3810,10 +3667,7 @@
         <w:ind w:left="680" w:hanging="227"/>
       </w:pPr>
       <w:r>
-        <w:t xml:space="preserve">• </w:t>
-      </w:r>
-      <w:r>
-        <w:t>I can file that for you. To make sure I file it correctly, can you confirm: (1) agency (I'll default to NYCT since you mentioned the 7 Line), (2) a brief headline, and (3) a description with any delay estimate?</w:t>
+        <w:t xml:space="preserve">• I can file that for you. To make sure I file it correctly, can you confirm: (1) agency (I'll default to NYCT since you mentioned the 7 Line), (2) a brief headline, and (3) a description with any delay estimate?</w:t>
       </w:r>
     </w:p>
     <w:p>
@@ -3837,10 +3691,7 @@
         <w:ind w:left="680" w:hanging="227"/>
       </w:pPr>
       <w:r>
-        <w:t xml:space="preserve">• </w:t>
-      </w:r>
-      <w:r>
-        <w:t>Yes, NYCT. Headline: signal problem at Grand Central. Description: signal issue affecting eastbound 7 trains, 15-minute delays expected.</w:t>
+        <w:t xml:space="preserve">• Yes, NYCT. Headline: signal problem at Grand Central. Description: signal issue affecting eastbound 7 trains, 15-minute delays expected.</w:t>
       </w:r>
     </w:p>
     <w:p>
@@ -3946,7 +3797,7 @@
         <w:t xml:space="preserve">2. </w:t>
       </w:r>
       <w:r>
-        <w:t>Click New Flow then Start From Scratch then Autolaunched Flow (No Trigger). Click Create.</w:t>
+        <w:t>Click New Flow then Autolaunched Flow (No Trigger). Click Create.</w:t>
       </w:r>
     </w:p>
     <w:p>
@@ -3970,10 +3821,7 @@
         <w:ind w:left="680" w:hanging="227"/>
       </w:pPr>
       <w:r>
-        <w:t xml:space="preserve">• </w:t>
-      </w:r>
-      <w:r>
-        <w:t>sdName - Text (for the SD-##### the dispatcher names)</w:t>
+        <w:t xml:space="preserve">• sdName - Text (for the SD-##### the dispatcher names)</w:t>
       </w:r>
     </w:p>
     <w:p>
@@ -3982,10 +3830,7 @@
         <w:ind w:left="680" w:hanging="227"/>
       </w:pPr>
       <w:r>
-        <w:t xml:space="preserve">• </w:t>
-      </w:r>
-      <w:r>
-        <w:t>resolutionNotes - Text</w:t>
+        <w:t xml:space="preserve">• resolutionNotes - Text</w:t>
       </w:r>
     </w:p>
     <w:p>
@@ -4009,10 +3854,7 @@
         <w:ind w:left="680" w:hanging="227"/>
       </w:pPr>
       <w:r>
-        <w:t xml:space="preserve">• </w:t>
-      </w:r>
-      <w:r>
-        <w:t>Label: Get Service Disruption By Name.</w:t>
+        <w:t xml:space="preserve">• Label: Get Service Disruption By Name.</w:t>
       </w:r>
     </w:p>
     <w:p>
@@ -4021,10 +3863,7 @@
         <w:ind w:left="680" w:hanging="227"/>
       </w:pPr>
       <w:r>
-        <w:t xml:space="preserve">• </w:t>
-      </w:r>
-      <w:r>
-        <w:t>Object: Service Disruption.</w:t>
+        <w:t xml:space="preserve">• Object: Service Disruption.</w:t>
       </w:r>
     </w:p>
     <w:p>
@@ -4033,10 +3872,7 @@
         <w:ind w:left="680" w:hanging="227"/>
       </w:pPr>
       <w:r>
-        <w:t xml:space="preserve">• </w:t>
-      </w:r>
-      <w:r>
-        <w:t>Filter: Name Equals {!sdName}.</w:t>
+        <w:t xml:space="preserve">• Filter: Name Equals {!sdName}.</w:t>
       </w:r>
     </w:p>
     <w:p>
@@ -4045,10 +3881,7 @@
         <w:ind w:left="680" w:hanging="227"/>
       </w:pPr>
       <w:r>
-        <w:t xml:space="preserve">• </w:t>
-      </w:r>
-      <w:r>
-        <w:t>Store: Only the first record. Automatically store all fields.</w:t>
+        <w:t xml:space="preserve">• Store: Only the first record. Automatically store all fields.</w:t>
       </w:r>
     </w:p>
     <w:p>
@@ -4072,10 +3905,7 @@
         <w:ind w:left="680" w:hanging="227"/>
       </w:pPr>
       <w:r>
-        <w:t xml:space="preserve">• </w:t>
-      </w:r>
-      <w:r>
-        <w:t>Label: Update Resolved Disruption.</w:t>
+        <w:t xml:space="preserve">• Label: Update Resolved Disruption.</w:t>
       </w:r>
     </w:p>
     <w:p>
@@ -4084,10 +3914,7 @@
         <w:ind w:left="680" w:hanging="227"/>
       </w:pPr>
       <w:r>
-        <w:t xml:space="preserve">• </w:t>
-      </w:r>
-      <w:r>
-        <w:t>How to Find: Specify conditions.</w:t>
+        <w:t xml:space="preserve">• How to Find: Specify conditions.</w:t>
       </w:r>
     </w:p>
     <w:p>
@@ -4096,10 +3923,7 @@
         <w:ind w:left="680" w:hanging="227"/>
       </w:pPr>
       <w:r>
-        <w:t xml:space="preserve">• </w:t>
-      </w:r>
-      <w:r>
-        <w:t>Object: Service Disruption.</w:t>
+        <w:t xml:space="preserve">• Object: Service Disruption.</w:t>
       </w:r>
     </w:p>
     <w:p>
@@ -4108,10 +3932,7 @@
         <w:ind w:left="680" w:hanging="227"/>
       </w:pPr>
       <w:r>
-        <w:t xml:space="preserve">• </w:t>
-      </w:r>
-      <w:r>
-        <w:t>Filter: Record ID Equals {!Get_Service_Disruption_By_Name.Id}.</w:t>
+        <w:t xml:space="preserve">• Filter: Record ID Equals {!Get_Service_Disruption_By_Name.Id}.</w:t>
       </w:r>
     </w:p>
     <w:p>
@@ -4120,10 +3941,7 @@
         <w:ind w:left="680" w:hanging="227"/>
       </w:pPr>
       <w:r>
-        <w:t xml:space="preserve">• </w:t>
-      </w:r>
-      <w:r>
-        <w:t>Set Field Values:</w:t>
+        <w:t xml:space="preserve">• Set Field Values:</w:t>
       </w:r>
     </w:p>
     <w:p>
@@ -4132,10 +3950,7 @@
         <w:ind w:left="680" w:hanging="227"/>
       </w:pPr>
       <w:r>
-        <w:t xml:space="preserve">• </w:t>
-      </w:r>
-      <w:r>
-        <w:t>Status: Cleared.</w:t>
+        <w:t xml:space="preserve">• Status: Cleared.</w:t>
       </w:r>
     </w:p>
     <w:p>
@@ -4144,10 +3959,7 @@
         <w:ind w:left="680" w:hanging="227"/>
       </w:pPr>
       <w:r>
-        <w:t xml:space="preserve">• </w:t>
-      </w:r>
-      <w:r>
-        <w:t>Disruption Cleared Date/Time: click the resource picker, then under $Flow click "Running Flow Interview" to drill in, then click CurrentDateTime. The value populates as {!$Flow.CurrentDateTime}.</w:t>
+        <w:t xml:space="preserve">• Disruption Cleared Date/Time: click the resource picker, then under $Flow click "Running Flow Interview" to drill in, then click CurrentDateTime. The value populates as {!$Flow.CurrentDateTime}.</w:t>
       </w:r>
     </w:p>
     <w:p>
@@ -4156,10 +3968,7 @@
         <w:ind w:left="680" w:hanging="227"/>
       </w:pPr>
       <w:r>
-        <w:t xml:space="preserve">• </w:t>
-      </w:r>
-      <w:r>
-        <w:t>Resolution_Notes__c: {!resolutionNotes}.</w:t>
+        <w:t xml:space="preserve">(Resolution Notes is on the Case object, not Service Disruption. If you want to persist resolution notes on the Service Disruption, add a Resolution_Notes__c field to Lab 5's data model first; the stretch skips this write.)</w:t>
       </w:r>
     </w:p>
     <w:p>
@@ -4183,10 +3992,7 @@
         <w:ind w:left="680" w:hanging="227"/>
       </w:pPr>
       <w:r>
-        <w:t xml:space="preserve">• </w:t>
-      </w:r>
-      <w:r>
-        <w:t>Flow Label: Resolve Service Disruption.</w:t>
+        <w:t xml:space="preserve">• Flow Label: Resolve Service Disruption.</w:t>
       </w:r>
     </w:p>
     <w:p>
@@ -4195,10 +4001,7 @@
         <w:ind w:left="680" w:hanging="227"/>
       </w:pPr>
       <w:r>
-        <w:t xml:space="preserve">• </w:t>
-      </w:r>
-      <w:r>
-        <w:t>Description: Clears a Service Disruption identified by Name. Sets Status to Cleared, Disruption Cleared Date/Time to now, and writes resolution notes.</w:t>
+        <w:t xml:space="preserve">• Description: Clears a Service Disruption identified by Name. Sets Status to Cleared, Disruption Cleared Date/Time to now, and writes resolution notes.</w:t>
       </w:r>
     </w:p>
     <w:p>
@@ -4384,10 +4187,7 @@
         <w:ind w:left="680" w:hanging="227"/>
       </w:pPr>
       <w:r>
-        <w:t xml:space="preserve">• </w:t>
-      </w:r>
-      <w:r>
-        <w:t>sdName: "The Service Disruption Name, formatted as SD-#####."</w:t>
+        <w:t xml:space="preserve">• sdName: "The Service Disruption Name, formatted as SD-#####."</w:t>
       </w:r>
     </w:p>
     <w:p>
@@ -4396,10 +4196,7 @@
         <w:ind w:left="680" w:hanging="227"/>
       </w:pPr>
       <w:r>
-        <w:t xml:space="preserve">• </w:t>
-      </w:r>
-      <w:r>
-        <w:t>resolutionNotes: "The dispatcher's notes on how the disruption was resolved."</w:t>
+        <w:t xml:space="preserve">• resolutionNotes: "The dispatcher's notes on how the disruption was resolved."</w:t>
       </w:r>
     </w:p>
     <w:p>
@@ -4465,10 +4262,7 @@
         <w:ind w:left="680" w:hanging="227"/>
       </w:pPr>
       <w:r>
-        <w:t xml:space="preserve">• </w:t>
-      </w:r>
-      <w:r>
-        <w:t>Close out SD-00042, we're back up. Signal cleared, trains running normally.</w:t>
+        <w:t xml:space="preserve">• Close out SD-00042, we're back up. Signal cleared, trains running normally.</w:t>
       </w:r>
     </w:p>
     <w:p>
@@ -4498,7 +4292,7 @@
         <w:t xml:space="preserve">3. </w:t>
       </w:r>
       <w:r>
-        <w:t>Open SD-00042. Verify Status = Cleared, Disruption Cleared Date/Time is populated, Resolution Notes contains "Signal cleared, trains running normally", and Duration (Minutes) is now populated (because both timestamps exist).</w:t>
+        <w:t>Open SD-00042. Verify Status = Cleared, Disruption Cleared Date/Time is populated, Duration (Minutes) is now populated (because both timestamps exist).</w:t>
       </w:r>
     </w:p>
     <w:p>

</xml_diff>